<commit_message>
Teklif 40.000 euro altı ve üstü ise güncelleme
</commit_message>
<xml_diff>
--- a/Offers/Templates/GarantiTeklif.docx
+++ b/Offers/Templates/GarantiTeklif.docx
@@ -1,6 +1,6 @@
 
 <file path=word/document.xml><?xml version="1.0" encoding="utf-8"?>
-<w:document xmlns:wpc="http://schemas.microsoft.com/office/word/2010/wordprocessingCanvas" xmlns:cx="http://schemas.microsoft.com/office/drawing/2014/chartex" xmlns:cx1="http://schemas.microsoft.com/office/drawing/2015/9/8/chartex" xmlns:cx2="http://schemas.microsoft.com/office/drawing/2015/10/21/chartex" xmlns:cx3="http://schemas.microsoft.com/office/drawing/2016/5/9/chartex" xmlns:cx4="http://schemas.microsoft.com/office/drawing/2016/5/10/chartex" xmlns:cx5="http://schemas.microsoft.com/office/drawing/2016/5/11/chartex" xmlns:cx6="http://schemas.microsoft.com/office/drawing/2016/5/12/chartex" xmlns:cx7="http://schemas.microsoft.com/office/drawing/2016/5/13/chartex" xmlns:cx8="http://schemas.microsoft.com/office/drawing/2016/5/14/chartex" xmlns:mc="http://schemas.openxmlformats.org/markup-compatibility/2006" xmlns:aink="http://schemas.microsoft.com/office/drawing/2016/ink" xmlns:am3d="http://schemas.microsoft.com/office/drawing/2017/model3d" xmlns:o="urn:schemas-microsoft-com:office:office" xmlns:oel="http://schemas.microsoft.com/office/2019/extlst" xmlns:r="http://schemas.openxmlformats.org/officeDocument/2006/relationships" xmlns:m="http://schemas.openxmlformats.org/officeDocument/2006/math" xmlns:v="urn:schemas-microsoft-com:vml" xmlns:wp14="http://schemas.microsoft.com/office/word/2010/wordprocessingDrawing" xmlns:wp="http://schemas.openxmlformats.org/drawingml/2006/wordprocessingDrawing" xmlns:w10="urn:schemas-microsoft-com:office:word" xmlns:w="http://schemas.openxmlformats.org/wordprocessingml/2006/main" xmlns:w14="http://schemas.microsoft.com/office/word/2010/wordml" xmlns:w15="http://schemas.microsoft.com/office/word/2012/wordml" xmlns:w16cex="http://schemas.microsoft.com/office/word/2018/wordml/cex" xmlns:w16cid="http://schemas.microsoft.com/office/word/2016/wordml/cid" xmlns:w16="http://schemas.microsoft.com/office/word/2018/wordml" xmlns:w16du="http://schemas.microsoft.com/office/word/2023/wordml/word16du" xmlns:w16sdtdh="http://schemas.microsoft.com/office/word/2020/wordml/sdtdatahash" xmlns:w16sdtfl="http://schemas.microsoft.com/office/word/2024/wordml/sdtformatlock" xmlns:w16se="http://schemas.microsoft.com/office/word/2015/wordml/symex" xmlns:wpg="http://schemas.microsoft.com/office/word/2010/wordprocessingGroup" xmlns:wpi="http://schemas.microsoft.com/office/word/2010/wordprocessingInk" xmlns:wne="http://schemas.microsoft.com/office/word/2006/wordml" xmlns:wps="http://schemas.microsoft.com/office/word/2010/wordprocessingShape" mc:Ignorable="w14 w15 w16se w16cid w16 w16cex w16sdtdh w16sdtfl w16du wp14">
+<w:document xmlns:wpc="http://schemas.microsoft.com/office/word/2010/wordprocessingCanvas" xmlns:cx="http://schemas.microsoft.com/office/drawing/2014/chartex" xmlns:cx1="http://schemas.microsoft.com/office/drawing/2015/9/8/chartex" xmlns:cx2="http://schemas.microsoft.com/office/drawing/2015/10/21/chartex" xmlns:cx3="http://schemas.microsoft.com/office/drawing/2016/5/9/chartex" xmlns:cx4="http://schemas.microsoft.com/office/drawing/2016/5/10/chartex" xmlns:cx5="http://schemas.microsoft.com/office/drawing/2016/5/11/chartex" xmlns:cx6="http://schemas.microsoft.com/office/drawing/2016/5/12/chartex" xmlns:cx7="http://schemas.microsoft.com/office/drawing/2016/5/13/chartex" xmlns:cx8="http://schemas.microsoft.com/office/drawing/2016/5/14/chartex" xmlns:mc="http://schemas.openxmlformats.org/markup-compatibility/2006" xmlns:aink="http://schemas.microsoft.com/office/drawing/2016/ink" xmlns:am3d="http://schemas.microsoft.com/office/drawing/2017/model3d" xmlns:o="urn:schemas-microsoft-com:office:office" xmlns:oel="http://schemas.microsoft.com/office/2019/extlst" xmlns:r="http://schemas.openxmlformats.org/officeDocument/2006/relationships" xmlns:m="http://schemas.openxmlformats.org/officeDocument/2006/math" xmlns:v="urn:schemas-microsoft-com:vml" xmlns:wp14="http://schemas.microsoft.com/office/word/2010/wordprocessingDrawing" xmlns:wp="http://schemas.openxmlformats.org/drawingml/2006/wordprocessingDrawing" xmlns:w10="urn:schemas-microsoft-com:office:word" xmlns:w="http://schemas.openxmlformats.org/wordprocessingml/2006/main" xmlns:w14="http://schemas.microsoft.com/office/word/2010/wordml" xmlns:w15="http://schemas.microsoft.com/office/word/2012/wordml" xmlns:w16cex="http://schemas.microsoft.com/office/word/2018/wordml/cex" xmlns:w16cid="http://schemas.microsoft.com/office/word/2016/wordml/cid" xmlns:w16="http://schemas.microsoft.com/office/word/2018/wordml" xmlns:w16du="http://schemas.microsoft.com/office/word/2023/wordml/word16du" xmlns:w16sdtdh="http://schemas.microsoft.com/office/word/2020/wordml/sdtdatahash" xmlns:w16se="http://schemas.microsoft.com/office/word/2015/wordml/symex" xmlns:wpg="http://schemas.microsoft.com/office/word/2010/wordprocessingGroup" xmlns:wpi="http://schemas.microsoft.com/office/word/2010/wordprocessingInk" xmlns:wne="http://schemas.microsoft.com/office/word/2006/wordml" xmlns:wps="http://schemas.microsoft.com/office/word/2010/wordprocessingShape" mc:Ignorable="w14 w15 w16se w16cid w16 w16cex w16sdtdh w16du wp14">
   <w:body>
     <w:tbl>
       <w:tblPr>
@@ -229,7 +229,7 @@
     </w:tbl>
     <w:p>
       <w:pPr>
-        <w:pStyle w:val="BodyText"/>
+        <w:pStyle w:val="GvdeMetni"/>
         <w:rPr>
           <w:rFonts w:ascii="Times New Roman"/>
           <w:sz w:val="20"/>
@@ -238,7 +238,7 @@
     </w:p>
     <w:p>
       <w:pPr>
-        <w:pStyle w:val="BodyText"/>
+        <w:pStyle w:val="GvdeMetni"/>
         <w:spacing w:before="83" w:after="1"/>
         <w:rPr>
           <w:rFonts w:ascii="Times New Roman"/>
@@ -1456,7 +1456,7 @@
     </w:tbl>
     <w:p>
       <w:pPr>
-        <w:pStyle w:val="BodyText"/>
+        <w:pStyle w:val="GvdeMetni"/>
         <w:rPr>
           <w:rFonts w:ascii="Times New Roman"/>
           <w:sz w:val="20"/>
@@ -1465,7 +1465,7 @@
     </w:p>
     <w:p>
       <w:pPr>
-        <w:pStyle w:val="BodyText"/>
+        <w:pStyle w:val="GvdeMetni"/>
         <w:rPr>
           <w:rFonts w:ascii="Times New Roman"/>
           <w:sz w:val="20"/>
@@ -1474,7 +1474,7 @@
     </w:p>
     <w:p>
       <w:pPr>
-        <w:pStyle w:val="BodyText"/>
+        <w:pStyle w:val="GvdeMetni"/>
         <w:spacing w:before="189"/>
         <w:rPr>
           <w:rFonts w:ascii="Times New Roman"/>
@@ -1618,7 +1618,7 @@
     </w:tbl>
     <w:p>
       <w:pPr>
-        <w:pStyle w:val="BodyText"/>
+        <w:pStyle w:val="GvdeMetni"/>
         <w:rPr>
           <w:rFonts w:ascii="Times New Roman"/>
         </w:rPr>
@@ -1626,7 +1626,7 @@
     </w:p>
     <w:p>
       <w:pPr>
-        <w:pStyle w:val="BodyText"/>
+        <w:pStyle w:val="GvdeMetni"/>
         <w:rPr>
           <w:rFonts w:ascii="Times New Roman"/>
         </w:rPr>
@@ -1634,7 +1634,7 @@
     </w:p>
     <w:p>
       <w:pPr>
-        <w:pStyle w:val="BodyText"/>
+        <w:pStyle w:val="GvdeMetni"/>
         <w:rPr>
           <w:rFonts w:ascii="Times New Roman"/>
         </w:rPr>
@@ -1642,7 +1642,7 @@
     </w:p>
     <w:p>
       <w:pPr>
-        <w:pStyle w:val="BodyText"/>
+        <w:pStyle w:val="GvdeMetni"/>
         <w:rPr>
           <w:rFonts w:ascii="Times New Roman"/>
         </w:rPr>
@@ -1650,7 +1650,7 @@
     </w:p>
     <w:p>
       <w:pPr>
-        <w:pStyle w:val="BodyText"/>
+        <w:pStyle w:val="GvdeMetni"/>
         <w:spacing w:before="199"/>
         <w:rPr>
           <w:rFonts w:ascii="Times New Roman"/>
@@ -1659,7 +1659,7 @@
     </w:p>
     <w:p>
       <w:pPr>
-        <w:pStyle w:val="BodyText"/>
+        <w:pStyle w:val="GvdeMetni"/>
         <w:spacing w:line="249" w:lineRule="auto"/>
         <w:ind w:left="75" w:right="130" w:firstLine="533"/>
         <w:jc w:val="both"/>
@@ -1688,7 +1688,7 @@
     </w:p>
     <w:p>
       <w:pPr>
-        <w:pStyle w:val="BodyText"/>
+        <w:pStyle w:val="GvdeMetni"/>
         <w:rPr>
           <w:sz w:val="20"/>
         </w:rPr>
@@ -1696,7 +1696,7 @@
     </w:p>
     <w:p>
       <w:pPr>
-        <w:pStyle w:val="BodyText"/>
+        <w:pStyle w:val="GvdeMetni"/>
         <w:rPr>
           <w:sz w:val="20"/>
         </w:rPr>
@@ -1704,7 +1704,7 @@
     </w:p>
     <w:p>
       <w:pPr>
-        <w:pStyle w:val="BodyText"/>
+        <w:pStyle w:val="GvdeMetni"/>
         <w:rPr>
           <w:sz w:val="20"/>
         </w:rPr>
@@ -1712,7 +1712,7 @@
     </w:p>
     <w:p>
       <w:pPr>
-        <w:pStyle w:val="BodyText"/>
+        <w:pStyle w:val="GvdeMetni"/>
         <w:rPr>
           <w:sz w:val="20"/>
         </w:rPr>
@@ -1720,7 +1720,7 @@
     </w:p>
     <w:p>
       <w:pPr>
-        <w:pStyle w:val="BodyText"/>
+        <w:pStyle w:val="GvdeMetni"/>
         <w:rPr>
           <w:sz w:val="20"/>
         </w:rPr>
@@ -1728,7 +1728,7 @@
     </w:p>
     <w:p>
       <w:pPr>
-        <w:pStyle w:val="BodyText"/>
+        <w:pStyle w:val="GvdeMetni"/>
         <w:rPr>
           <w:sz w:val="20"/>
         </w:rPr>
@@ -1736,7 +1736,7 @@
     </w:p>
     <w:p>
       <w:pPr>
-        <w:pStyle w:val="BodyText"/>
+        <w:pStyle w:val="GvdeMetni"/>
         <w:spacing w:before="176"/>
         <w:rPr>
           <w:sz w:val="20"/>
@@ -2225,7 +2225,7 @@
     </w:p>
     <w:p>
       <w:pPr>
-        <w:pStyle w:val="BodyText"/>
+        <w:pStyle w:val="GvdeMetni"/>
         <w:spacing w:before="3"/>
         <w:rPr>
           <w:sz w:val="2"/>
@@ -2532,25 +2532,13 @@
               <w:ind w:left="106" w:firstLine="201"/>
             </w:pPr>
             <w:r>
-              <w:t>İş Planı Hazırlığı (Teknik</w:t>
-            </w:r>
-            <w:r>
-              <w:rPr>
-                <w:spacing w:val="-6"/>
-              </w:rPr>
-              <w:t xml:space="preserve"> </w:t>
-            </w:r>
-            <w:r>
-              <w:t>Proje</w:t>
-            </w:r>
-            <w:r>
-              <w:rPr>
-                <w:spacing w:val="-5"/>
-              </w:rPr>
-              <w:t xml:space="preserve"> </w:t>
-            </w:r>
-            <w:r>
-              <w:t>Hariç)</w:t>
+              <w:t>İş Planı Hazırlığı (</w:t>
+            </w:r>
+            <w:r>
+              <w:t>ABCD</w:t>
+            </w:r>
+            <w:r>
+              <w:t>)</w:t>
             </w:r>
           </w:p>
         </w:tc>
@@ -3543,7 +3531,7 @@
     </w:p>
     <w:p>
       <w:pPr>
-        <w:pStyle w:val="BodyText"/>
+        <w:pStyle w:val="GvdeMetni"/>
         <w:spacing w:before="95"/>
         <w:rPr>
           <w:b/>
@@ -4481,7 +4469,7 @@
     </w:tbl>
     <w:p>
       <w:pPr>
-        <w:pStyle w:val="BodyText"/>
+        <w:pStyle w:val="GvdeMetni"/>
         <w:rPr>
           <w:b/>
         </w:rPr>
@@ -4489,7 +4477,7 @@
     </w:p>
     <w:p>
       <w:pPr>
-        <w:pStyle w:val="BodyText"/>
+        <w:pStyle w:val="GvdeMetni"/>
         <w:spacing w:before="32"/>
         <w:rPr>
           <w:b/>
@@ -4602,7 +4590,7 @@
     </w:p>
     <w:p>
       <w:pPr>
-        <w:pStyle w:val="BodyText"/>
+        <w:pStyle w:val="GvdeMetni"/>
         <w:spacing w:before="29"/>
         <w:rPr>
           <w:b/>
@@ -5476,7 +5464,7 @@
     </w:tbl>
     <w:p>
       <w:pPr>
-        <w:pStyle w:val="BodyText"/>
+        <w:pStyle w:val="GvdeMetni"/>
         <w:spacing w:before="60"/>
         <w:rPr>
           <w:b/>
@@ -5538,7 +5526,7 @@
     </w:p>
     <w:p>
       <w:pPr>
-        <w:pStyle w:val="BodyText"/>
+        <w:pStyle w:val="GvdeMetni"/>
         <w:spacing w:before="35"/>
         <w:rPr>
           <w:b/>
@@ -6187,7 +6175,7 @@
 </file>
 
 <file path=word/styles.xml><?xml version="1.0" encoding="utf-8"?>
-<w:styles xmlns:mc="http://schemas.openxmlformats.org/markup-compatibility/2006" xmlns:r="http://schemas.openxmlformats.org/officeDocument/2006/relationships" xmlns:w="http://schemas.openxmlformats.org/wordprocessingml/2006/main" xmlns:w14="http://schemas.microsoft.com/office/word/2010/wordml" xmlns:w15="http://schemas.microsoft.com/office/word/2012/wordml" xmlns:w16cex="http://schemas.microsoft.com/office/word/2018/wordml/cex" xmlns:w16cid="http://schemas.microsoft.com/office/word/2016/wordml/cid" xmlns:w16="http://schemas.microsoft.com/office/word/2018/wordml" xmlns:w16du="http://schemas.microsoft.com/office/word/2023/wordml/word16du" xmlns:w16sdtdh="http://schemas.microsoft.com/office/word/2020/wordml/sdtdatahash" xmlns:w16sdtfl="http://schemas.microsoft.com/office/word/2024/wordml/sdtformatlock" xmlns:w16se="http://schemas.microsoft.com/office/word/2015/wordml/symex" mc:Ignorable="w14 w15 w16se w16cid w16 w16cex w16sdtdh w16sdtfl w16du">
+<w:styles xmlns:mc="http://schemas.openxmlformats.org/markup-compatibility/2006" xmlns:r="http://schemas.openxmlformats.org/officeDocument/2006/relationships" xmlns:w="http://schemas.openxmlformats.org/wordprocessingml/2006/main" xmlns:w14="http://schemas.microsoft.com/office/word/2010/wordml" xmlns:w15="http://schemas.microsoft.com/office/word/2012/wordml" xmlns:w16cex="http://schemas.microsoft.com/office/word/2018/wordml/cex" xmlns:w16cid="http://schemas.microsoft.com/office/word/2016/wordml/cid" xmlns:w16="http://schemas.microsoft.com/office/word/2018/wordml" xmlns:w16du="http://schemas.microsoft.com/office/word/2023/wordml/word16du" xmlns:w16sdtdh="http://schemas.microsoft.com/office/word/2020/wordml/sdtdatahash" xmlns:w16se="http://schemas.microsoft.com/office/word/2015/wordml/symex" mc:Ignorable="w14 w15 w16se w16cid w16 w16cex w16sdtdh w16du">
   <w:docDefaults>
     <w:rPrDefault>
       <w:rPr>
@@ -6591,13 +6579,13 @@
       <w:lang w:val="tr-TR"/>
     </w:rPr>
   </w:style>
-  <w:style w:type="character" w:default="1" w:styleId="DefaultParagraphFont">
+  <w:style w:type="character" w:default="1" w:styleId="VarsaylanParagrafYazTipi">
     <w:name w:val="Default Paragraph Font"/>
     <w:uiPriority w:val="1"/>
     <w:semiHidden/>
     <w:unhideWhenUsed/>
   </w:style>
-  <w:style w:type="table" w:default="1" w:styleId="TableNormal">
+  <w:style w:type="table" w:default="1" w:styleId="NormalTablo">
     <w:name w:val="Normal Table"/>
     <w:uiPriority w:val="99"/>
     <w:semiHidden/>
@@ -6612,19 +6600,19 @@
       </w:tblCellMar>
     </w:tblPr>
   </w:style>
-  <w:style w:type="numbering" w:default="1" w:styleId="NoList">
+  <w:style w:type="numbering" w:default="1" w:styleId="ListeYok">
     <w:name w:val="No List"/>
     <w:uiPriority w:val="99"/>
     <w:semiHidden/>
     <w:unhideWhenUsed/>
   </w:style>
-  <w:style w:type="paragraph" w:styleId="BodyText">
+  <w:style w:type="paragraph" w:styleId="GvdeMetni">
     <w:name w:val="Body Text"/>
     <w:basedOn w:val="Normal"/>
     <w:uiPriority w:val="1"/>
     <w:qFormat/>
   </w:style>
-  <w:style w:type="paragraph" w:styleId="ListParagraph">
+  <w:style w:type="paragraph" w:styleId="ListeParagraf">
     <w:name w:val="List Paragraph"/>
     <w:basedOn w:val="Normal"/>
     <w:uiPriority w:val="1"/>

</xml_diff>